<commit_message>
Review: indent body paragraphs only
Co-Authored-By: Claude Sonnet 5.5 <noreply@anthropic.com>
Claude-Session: https://claude.ai/code/session_01Y1g9vByMLTE8eGJ9K81zt6
</commit_message>
<xml_diff>
--- a/review/Biodegradable_Metallic_Implants_Review_AS_format_v4.docx
+++ b/review/Biodegradable_Metallic_Implants_Review_AS_format_v4.docx
@@ -5,6 +5,7 @@
     <w:p>
       <w:pPr>
         <w:spacing w:line="276" w:lineRule="auto" w:after="240"/>
+        <w:ind w:firstLine="0"/>
         <w:jc w:val="left"/>
       </w:pPr>
       <w:bookmarkStart w:id="0" w:name="_Hlk238563804"/>
@@ -31,10 +32,15 @@
       </w:r>
     </w:p>
     <w:bookmarkEnd w:id="0"/>
-    <w:p/>
+    <w:p>
+      <w:pPr>
+        <w:ind w:firstLine="0"/>
+      </w:pPr>
+    </w:p>
     <w:p>
       <w:pPr>
         <w:spacing w:line="276" w:lineRule="auto" w:after="120"/>
+        <w:ind w:firstLine="0"/>
       </w:pPr>
       <w:r>
         <w:rPr>
@@ -318,6 +324,7 @@
     <w:p>
       <w:pPr>
         <w:spacing w:line="240" w:lineRule="auto"/>
+        <w:ind w:firstLine="0"/>
         <w:jc w:val="left"/>
       </w:pPr>
       <m:oMath>
@@ -360,6 +367,7 @@
     <w:p>
       <w:pPr>
         <w:spacing w:line="240" w:lineRule="auto"/>
+        <w:ind w:firstLine="0"/>
         <w:jc w:val="left"/>
       </w:pPr>
       <m:oMath>
@@ -402,6 +410,7 @@
     <w:p>
       <w:pPr>
         <w:spacing w:line="240" w:lineRule="auto"/>
+        <w:ind w:firstLine="0"/>
         <w:jc w:val="left"/>
       </w:pPr>
       <m:oMath>
@@ -441,10 +450,15 @@
         <w:t>Department of Mechanical and Aerospace Engineering, Monash University, Wellington Rd, Clayton, VIC 3800, Australia</w:t>
       </w:r>
     </w:p>
-    <w:p/>
+    <w:p>
+      <w:pPr>
+        <w:ind w:firstLine="0"/>
+      </w:pPr>
+    </w:p>
     <w:p>
       <w:pPr>
         <w:pStyle w:val="AbstractTitle"/>
+        <w:ind w:firstLine="0"/>
       </w:pPr>
       <w:r>
         <w:t>Abstract</w:t>
@@ -453,6 +467,7 @@
     <w:p>
       <w:pPr>
         <w:pStyle w:val="Abstract"/>
+        <w:ind w:firstLine="0"/>
       </w:pPr>
       <w:r>
         <w:t>Zinc has emerged as a promising biodegradable metal for temporary implant applications. Despite extensive experimental studies, predictive computational frameworks for Zn biodegradation under physiological conditions remain limited. In this study, a three-dimensional mechanistic reaction-diffusion framework is developed by coupling oxygen reduction reaction (ORR) kinetics, mass transport, corrosion-product evolution, and moving-interface tracking. Initial sensitivity analysis showed that dissolved oxygen availability as the primary control on Zn biodegradation. The model was calibrated against literature-reported immersion mass-loss data and predicted 28-day immersion experiments of pure Zn in Hanks' Balanced Salt Solution, yielding a root-mean-square error of 0.0159%. Application of the calibrated model to a six-crown Zn stent, without parameter refitting, produced degradation trends consistent with reported in vivo observations and demonstrated that geometry-dependent material loss emerges naturally from local variations in oxygen transport and corrosion-product evolution. Overall, the proposed framework establishes a predictive foundation for the design and evaluation of biodegradable Zn implants.</w:t>
@@ -461,6 +476,7 @@
     <w:p>
       <w:pPr>
         <w:pStyle w:val="BodyText"/>
+        <w:ind w:firstLine="0"/>
         <w:jc w:val="left"/>
       </w:pPr>
       <w:r>
@@ -476,6 +492,7 @@
     </w:p>
     <w:p>
       <w:pPr>
+        <w:ind w:firstLine="0"/>
         <w:rPr>
           <w:rFonts w:eastAsiaTheme="majorEastAsia"/>
           <w:color w:val="1F4E79"/>
@@ -500,6 +517,9 @@
       <w:bookmarkEnd w:id="1"/>
     </w:p>
     <w:p>
+      <w:pPr>
+        <w:ind w:firstLine="431"/>
+      </w:pPr>
       <w:r>
         <w:t xml:space="preserve">Modern medicine increasingly relies on metallic implants to restore physiological function and provide structural support in </w:t>
       </w:r>
@@ -661,6 +681,9 @@
       </w:r>
     </w:p>
     <w:p>
+      <w:pPr>
+        <w:ind w:firstLine="431"/>
+      </w:pPr>
       <w:r>
         <w:t xml:space="preserve">Unlike permanent devices, biodegradable metallic implants are dynamic systems whose geometry, surface condition, mechanical capacity, and biological interactions evolve continuously after implantation. Coupled electrochemical reactions, mass transport, corrosion-product formation, mechanical loading, and local tissue responses govern their degradation, and material composition, microstructure, manufacturing history, and implant geometry further influence it </w:t>
       </w:r>
@@ -754,6 +777,9 @@
       </w:r>
     </w:p>
     <w:p>
+      <w:pPr>
+        <w:ind w:firstLine="431"/>
+      </w:pPr>
       <w:r>
         <w:t xml:space="preserve">The design of biodegradable metallic implants is governed by four interdependent mismatches. First, implant degradation must be synchronized with tissue healing: premature degradation may cause loss of fixation or structural support, whereas prolonged persistence may negate the advantages of a temporary device </w:t>
       </w:r>
@@ -855,6 +881,9 @@
       </w:r>
     </w:p>
     <w:p>
+      <w:pPr>
+        <w:ind w:firstLine="431"/>
+      </w:pPr>
       <w:r>
         <w:t xml:space="preserve">This review critically examines the computational design of biodegradable metallic implants across Mg-, Fe-, and Zn-based systems, </w:t>
       </w:r>
@@ -927,6 +956,9 @@
       </w:r>
     </w:p>
     <w:p>
+      <w:pPr>
+        <w:ind w:firstLine="431"/>
+      </w:pPr>
       <w:r>
         <w:t xml:space="preserve">This review </w:t>
       </w:r>
@@ -975,7 +1007,9 @@
       </w:r>
     </w:p>
     <w:p>
-      <w:pPr/>
+      <w:pPr>
+        <w:ind w:firstLine="431"/>
+      </w:pPr>
       <w:r>
         <w:t>Table 1 summarizes the strength, stiffness, device-specific, degradation and material requirements for the device classes discussed below.</w:t>
       </w:r>
@@ -984,6 +1018,7 @@
       <w:pPr>
         <w:keepNext/>
         <w:spacing w:line="276" w:lineRule="auto"/>
+        <w:ind w:firstLine="0"/>
         <w:jc w:val="left"/>
       </w:pPr>
       <w:r>
@@ -1484,7 +1519,9 @@
       </w:tr>
     </w:tbl>
     <w:p>
-      <w:pPr/>
+      <w:pPr>
+        <w:ind w:firstLine="0"/>
+      </w:pPr>
     </w:p>
     <w:p>
       <w:pPr>
@@ -1496,6 +1533,7 @@
     </w:p>
     <w:p>
       <w:pPr>
+        <w:ind w:firstLine="431"/>
         <w:rPr>
           <w:lang w:eastAsia="en-US"/>
         </w:rPr>
@@ -1784,6 +1822,9 @@
       </w:r>
     </w:p>
     <w:p>
+      <w:pPr>
+        <w:ind w:firstLine="431"/>
+      </w:pPr>
       <w:r>
         <w:t xml:space="preserve">Within this shared framework, geometric design fundamentally influences the mechanical demands placed on each fixation device. Screws and interference screws are primarily evaluated through pull-out strength, insertion torque, and torsional resistance because their clinical performance depends on achieving sufficient anchorage within bone and resisting loosening under physiological loading before biological fixation develops. Reported pull-out strengths vary widely depending on material and design, ranging from approximately 200 to 800 N for magnesium-based screws and reaching nearly 3800 N in friction-welded iron-stainless steel hybrid systems developed to enhance fixation strength </w:t>
       </w:r>
@@ -1912,6 +1953,7 @@
     </w:p>
     <w:p>
       <w:pPr>
+        <w:ind w:firstLine="431"/>
         <w:rPr>
           <w:lang w:eastAsia="en-US"/>
         </w:rPr>
@@ -2047,6 +2089,9 @@
       </w:r>
     </w:p>
     <w:p>
+      <w:pPr>
+        <w:ind w:firstLine="431"/>
+      </w:pPr>
       <w:r>
         <w:t xml:space="preserve">These biological advantages </w:t>
       </w:r>
@@ -2104,6 +2149,9 @@
       </w:r>
     </w:p>
     <w:p>
+      <w:pPr>
+        <w:ind w:firstLine="431"/>
+      </w:pPr>
       <w:r>
         <w:t xml:space="preserve">Material selection therefore remains a critical determinant of scaffold </w:t>
       </w:r>
@@ -2180,7 +2228,11 @@
         <w:t>.</w:t>
       </w:r>
     </w:p>
-    <w:p/>
+    <w:p>
+      <w:pPr>
+        <w:ind w:firstLine="0"/>
+      </w:pPr>
+    </w:p>
     <w:p>
       <w:pPr>
         <w:pStyle w:val="Heading3"/>
@@ -2191,6 +2243,7 @@
     </w:p>
     <w:p>
       <w:pPr>
+        <w:ind w:firstLine="431"/>
         <w:rPr>
           <w:lang w:eastAsia="en-US"/>
         </w:rPr>
@@ -2267,6 +2320,9 @@
       </w:r>
     </w:p>
     <w:p>
+      <w:pPr>
+        <w:ind w:firstLine="431"/>
+      </w:pPr>
       <w:r>
         <w:t xml:space="preserve">Beyond material selection, strut geometry strongly influences clinical performance because stents interact directly with the local hemodynamic environment. Increasing strut thickness improves radial stiffness and load-bearing capacity but also protrudes further into the vessel lumen, disturbing endothelial shear stress and promoting flow recirculation zones associated with thrombosis and restenosis </w:t>
       </w:r>
@@ -2346,7 +2402,11 @@
         <w:t>These performance objectives are commonly evaluated using standardized protocols, including ASTM F2477 for pulsatile fatigue durability, ASTM F3067 for radial compression testing, and ISO 25539-2 for endovascular device performance, providing the experimental and regulatory framework against which computational and physical stent designs are validated.</w:t>
       </w:r>
     </w:p>
-    <w:p/>
+    <w:p>
+      <w:pPr>
+        <w:ind w:firstLine="0"/>
+      </w:pPr>
+    </w:p>
     <w:p>
       <w:pPr>
         <w:pStyle w:val="Heading2"/>
@@ -2356,6 +2416,9 @@
       </w:r>
     </w:p>
     <w:p>
+      <w:pPr>
+        <w:ind w:firstLine="431"/>
+      </w:pPr>
       <w:r>
         <w:t xml:space="preserve">Permanent implant alloys such as 316L stainless steel, Ti-6Al-4V, and Co-Cr were developed under a static design paradigm in which mechanical strength and corrosion resistance are maximized and subsequently maintained throughout the implant lifetime </w:t>
       </w:r>
@@ -2434,6 +2497,9 @@
       </w:r>
     </w:p>
     <w:p>
+      <w:pPr>
+        <w:ind w:firstLine="431"/>
+      </w:pPr>
       <w:r>
         <w:t xml:space="preserve">This evolving behavior directly affects how loads are transferred between the implant and surrounding tissue. In permanent implants, mechanical support remains largely unchanged after implantation, often resulting in prolonged stress shielding as the device continues to bear a substantial fraction of physiological load as healing progresses </w:t>
       </w:r>
@@ -2487,6 +2553,9 @@
       </w:r>
     </w:p>
     <w:p>
+      <w:pPr>
+        <w:ind w:firstLine="431"/>
+      </w:pPr>
       <w:r>
         <w:t xml:space="preserve">Because load transfer must follow biological healing rather than material degradation alone, mechanical retention requirements are inherently time-dependent. Near-complete fixation stability is generally required during the first 4-6 weeks, when inflammatory tissue and soft callus contribute to little intrinsic load-bearing capacity. As healing progresses and hard callus formation begins, fixation devices are typically expected to retain at least 50% of their initial strength in load-bearing applications and approximately 30% in non-load-bearing applications. By the completion of cortical union or vascular remodeling, generally between 6 and 12 months depending on the application, most mechanical responsibility should have shifted to the host tissue </w:t>
       </w:r>
@@ -2534,6 +2603,9 @@
       </w:r>
     </w:p>
     <w:p>
+      <w:pPr>
+        <w:ind w:firstLine="431"/>
+      </w:pPr>
       <w:r>
         <w:t xml:space="preserve">Achieving this synchronization requires degradation kinetics to fall within a relatively narrow therapeutic window. Magnesium-based implants often degrade too rapidly, with reported corrosion rates of approximately 0.5-2.7 mm year⁻¹, substantially exceeding the rates typically considered compatible with bone healing. Rapid corrosion can lead to premature loss of mechanical support, hydrogen evolution, and localized alkalization </w:t>
       </w:r>
@@ -2608,6 +2680,9 @@
       </w:r>
     </w:p>
     <w:p>
+      <w:pPr>
+        <w:ind w:firstLine="431"/>
+      </w:pPr>
       <w:r>
         <w:lastRenderedPageBreak/>
         <w:t xml:space="preserve">More broadly, implant performance can be viewed through a healing-degradation performance corridor defined by the </w:t>
@@ -2683,6 +2758,9 @@
       </w:r>
     </w:p>
     <w:p>
+      <w:pPr>
+        <w:ind w:firstLine="431"/>
+      </w:pPr>
       <w:r>
         <w:t xml:space="preserve">These considerations have driven the emergence of lifetime-aware design, in which degradation is treated not as an unavoidable material limitation but as an engineering parameter that can be deliberately tailored to clinical requirements </w:t>
       </w:r>
@@ -2708,7 +2786,11 @@
         <w:t>. Within this framework, the objective is no longer to maximize initial strength or minimize corrosion, but to optimize the implant's entire performance trajectory so mechanical support, degradation, and tissue regeneration remain synchronized throughout healing. Consequently, a central challenge for computational design is predicting when implant load-bearing capacity will decline below the level that healing tissue can safely compensate for and using those predictions to engineer patient- and application-specific degradation profiles.</w:t>
       </w:r>
     </w:p>
-    <w:p/>
+    <w:p>
+      <w:pPr>
+        <w:ind w:firstLine="0"/>
+      </w:pPr>
+    </w:p>
     <w:p>
       <w:pPr>
         <w:pStyle w:val="Heading2"/>
@@ -2718,6 +2800,9 @@
       </w:r>
     </w:p>
     <w:p>
+      <w:pPr>
+        <w:ind w:firstLine="0"/>
+      </w:pPr>
       <w:r>
         <w:rPr>
           <w:b/>
@@ -2729,11 +2814,17 @@
       </w:r>
     </w:p>
     <w:p>
+      <w:pPr>
+        <w:ind w:firstLine="0"/>
+      </w:pPr>
       <w:r>
         <w:t>[Add review text and citations here]</w:t>
       </w:r>
     </w:p>
     <w:p>
+      <w:pPr>
+        <w:ind w:firstLine="431"/>
+      </w:pPr>
       <w:r>
         <w:t xml:space="preserve">Continuous mass loss during biocorrosion can lead to several distinct failure modes in biodegradable Mg-, Zn-, and Fe-based implants, rather than a single outcome governed solely by degradation rate. Implant failure depends not only on how rapidly material is lost but also on the spatial distribution of corrosion, the mechanical loading environment, and the ability of the implant to maintain its intended function throughout healing. Consequently, acceptable performance must be defined through multiple mechanical and biological criteria rather than by a degradation-rate corridor alone </w:t>
       </w:r>
@@ -2760,6 +2851,9 @@
       </w:r>
     </w:p>
     <w:p>
+      <w:pPr>
+        <w:ind w:firstLine="431"/>
+      </w:pPr>
       <w:r>
         <w:lastRenderedPageBreak/>
         <w:t xml:space="preserve">One of the most important determinants of failure is </w:t>
@@ -2832,6 +2926,9 @@
       </w:r>
     </w:p>
     <w:p>
+      <w:pPr>
+        <w:ind w:firstLine="431"/>
+      </w:pPr>
       <w:r>
         <w:t xml:space="preserve">Localized damage becomes even more critical under cyclic physiological loading, where corrosion and fatigue interact synergistically. Repeated loading ruptures protective surface films, continuously exposing fresh metal and transforming corrosion pits into fatigue crack initiation sites. As a result, magnesium alloys can experience </w:t>
       </w:r>
@@ -2927,6 +3024,9 @@
       </w:r>
     </w:p>
     <w:p>
+      <w:pPr>
+        <w:ind w:firstLine="431"/>
+      </w:pPr>
       <w:r>
         <w:t xml:space="preserve">In addition to fracture and fatigue failure, degradable fixation devices may fail through progressive loss of fixation stability. Localized corrosion around screw threads, plate holes, and other geometric discontinuities reduces extraction torque, bending stiffness, and overall construct stability before complete structural failure occurs. For example, degrading Herbert screws have exhibited a reduction in bending stiffness from approximately 15 GPa to 8 GPa over 6-12 weeks, whereas magnesium plate-and-screw systems show measurable reductions in fixation strength during early stages of degradation </w:t>
       </w:r>
@@ -2978,6 +3078,9 @@
       </w:r>
     </w:p>
     <w:p>
+      <w:pPr>
+        <w:ind w:firstLine="431"/>
+      </w:pPr>
       <w:r>
         <w:t xml:space="preserve">Failure can also arise when degradation is excessively slow. In such cases, implants persist beyond their intended functional lifetime and continue to behave as permanent foreign bodies. This issue is especially evident in iron-based systems, where in vivo studies have demonstrated multi-year structural persistence accompanied by the formation of dense iron oxide and hydroxide layers that inhibit complete resorption </w:t>
       </w:r>
@@ -3031,6 +3134,9 @@
       </w:r>
     </w:p>
     <w:p>
+      <w:pPr>
+        <w:ind w:firstLine="431"/>
+      </w:pPr>
       <w:r>
         <w:t xml:space="preserve">Beyond mechanical considerations, biodegradable implants must also satisfy biological acceptance criteria related to their degradation products. Magnesium degradation produces hydrogen gas and </w:t>
       </w:r>
@@ -3104,6 +3210,9 @@
       </w:r>
     </w:p>
     <w:p>
+      <w:pPr>
+        <w:ind w:firstLine="0"/>
+      </w:pPr>
       <w:r>
         <w:rPr>
           <w:b/>
@@ -3115,6 +3224,9 @@
       </w:r>
     </w:p>
     <w:p>
+      <w:pPr>
+        <w:ind w:firstLine="0"/>
+      </w:pPr>
       <w:r>
         <w:t>[Add review text and citations here]</w:t>
       </w:r>
@@ -3136,6 +3248,9 @@
       </w:r>
     </w:p>
     <w:p>
+      <w:pPr>
+        <w:ind w:firstLine="0"/>
+      </w:pPr>
       <w:r>
         <w:rPr>
           <w:b/>
@@ -3147,6 +3262,9 @@
       </w:r>
     </w:p>
     <w:p>
+      <w:pPr>
+        <w:ind w:firstLine="0"/>
+      </w:pPr>
       <w:r>
         <w:t>[Add review text and citations here]</w:t>
       </w:r>
@@ -3160,6 +3278,9 @@
       </w:r>
     </w:p>
     <w:p>
+      <w:pPr>
+        <w:ind w:firstLine="0"/>
+      </w:pPr>
       <w:r>
         <w:rPr>
           <w:b/>
@@ -3177,6 +3298,9 @@
       </w:r>
     </w:p>
     <w:p>
+      <w:pPr>
+        <w:ind w:firstLine="0"/>
+      </w:pPr>
       <w:r>
         <w:t>[Add review text and citations here]</w:t>
       </w:r>
@@ -3190,6 +3314,9 @@
       </w:r>
     </w:p>
     <w:p>
+      <w:pPr>
+        <w:ind w:firstLine="0"/>
+      </w:pPr>
       <w:r>
         <w:rPr>
           <w:b/>
@@ -3201,6 +3328,9 @@
       </w:r>
     </w:p>
     <w:p>
+      <w:pPr>
+        <w:ind w:firstLine="0"/>
+      </w:pPr>
       <w:r>
         <w:t>[Add review text and citations here]</w:t>
       </w:r>
@@ -3214,6 +3344,9 @@
       </w:r>
     </w:p>
     <w:p>
+      <w:pPr>
+        <w:ind w:firstLine="0"/>
+      </w:pPr>
       <w:r>
         <w:rPr>
           <w:b/>
@@ -3225,6 +3358,9 @@
       </w:r>
     </w:p>
     <w:p>
+      <w:pPr>
+        <w:ind w:firstLine="0"/>
+      </w:pPr>
       <w:r>
         <w:t>[Add review text and citations here]</w:t>
       </w:r>
@@ -3238,6 +3374,9 @@
       </w:r>
     </w:p>
     <w:p>
+      <w:pPr>
+        <w:ind w:firstLine="0"/>
+      </w:pPr>
       <w:r>
         <w:rPr>
           <w:b/>
@@ -3249,6 +3388,9 @@
       </w:r>
     </w:p>
     <w:p>
+      <w:pPr>
+        <w:ind w:firstLine="0"/>
+      </w:pPr>
       <w:r>
         <w:t>[Add review text and citations here]</w:t>
       </w:r>
@@ -3270,6 +3412,9 @@
       </w:r>
     </w:p>
     <w:p>
+      <w:pPr>
+        <w:ind w:firstLine="0"/>
+      </w:pPr>
       <w:r>
         <w:rPr>
           <w:b/>
@@ -3281,6 +3426,9 @@
       </w:r>
     </w:p>
     <w:p>
+      <w:pPr>
+        <w:ind w:firstLine="0"/>
+      </w:pPr>
       <w:r>
         <w:t>[Add review text and citations here]</w:t>
       </w:r>
@@ -3294,6 +3442,9 @@
       </w:r>
     </w:p>
     <w:p>
+      <w:pPr>
+        <w:ind w:firstLine="0"/>
+      </w:pPr>
       <w:r>
         <w:rPr>
           <w:b/>
@@ -3305,6 +3456,9 @@
       </w:r>
     </w:p>
     <w:p>
+      <w:pPr>
+        <w:ind w:firstLine="0"/>
+      </w:pPr>
       <w:r>
         <w:t>[Add review text and citations here]</w:t>
       </w:r>
@@ -3318,6 +3472,9 @@
       </w:r>
     </w:p>
     <w:p>
+      <w:pPr>
+        <w:ind w:firstLine="0"/>
+      </w:pPr>
       <w:r>
         <w:rPr>
           <w:b/>
@@ -3329,6 +3486,9 @@
       </w:r>
     </w:p>
     <w:p>
+      <w:pPr>
+        <w:ind w:firstLine="0"/>
+      </w:pPr>
       <w:r>
         <w:t>[Add review text and citations here]</w:t>
       </w:r>
@@ -3342,6 +3502,9 @@
       </w:r>
     </w:p>
     <w:p>
+      <w:pPr>
+        <w:ind w:firstLine="0"/>
+      </w:pPr>
       <w:r>
         <w:rPr>
           <w:b/>
@@ -3353,6 +3516,9 @@
       </w:r>
     </w:p>
     <w:p>
+      <w:pPr>
+        <w:ind w:firstLine="0"/>
+      </w:pPr>
       <w:r>
         <w:t>[Add review text and citations here]</w:t>
       </w:r>
@@ -3366,6 +3532,9 @@
       </w:r>
     </w:p>
     <w:p>
+      <w:pPr>
+        <w:ind w:firstLine="0"/>
+      </w:pPr>
       <w:r>
         <w:rPr>
           <w:b/>
@@ -3377,6 +3546,9 @@
       </w:r>
     </w:p>
     <w:p>
+      <w:pPr>
+        <w:ind w:firstLine="0"/>
+      </w:pPr>
       <w:r>
         <w:t>[Add review text and citations here]</w:t>
       </w:r>
@@ -3390,6 +3562,9 @@
       </w:r>
     </w:p>
     <w:p>
+      <w:pPr>
+        <w:ind w:firstLine="0"/>
+      </w:pPr>
       <w:r>
         <w:rPr>
           <w:b/>
@@ -3401,6 +3576,9 @@
       </w:r>
     </w:p>
     <w:p>
+      <w:pPr>
+        <w:ind w:firstLine="0"/>
+      </w:pPr>
       <w:r>
         <w:t>[Add review text and citations here]</w:t>
       </w:r>
@@ -3422,6 +3600,9 @@
       </w:r>
     </w:p>
     <w:p>
+      <w:pPr>
+        <w:ind w:firstLine="0"/>
+      </w:pPr>
       <w:r>
         <w:rPr>
           <w:b/>
@@ -3433,6 +3614,9 @@
       </w:r>
     </w:p>
     <w:p>
+      <w:pPr>
+        <w:ind w:firstLine="0"/>
+      </w:pPr>
       <w:r>
         <w:t>[Add review text and citations here]</w:t>
       </w:r>
@@ -3446,6 +3630,9 @@
       </w:r>
     </w:p>
     <w:p>
+      <w:pPr>
+        <w:ind w:firstLine="0"/>
+      </w:pPr>
       <w:r>
         <w:rPr>
           <w:b/>
@@ -3457,6 +3644,9 @@
       </w:r>
     </w:p>
     <w:p>
+      <w:pPr>
+        <w:ind w:firstLine="0"/>
+      </w:pPr>
       <w:r>
         <w:lastRenderedPageBreak/>
         <w:t>[Add review text and citations here]</w:t>
@@ -3471,6 +3661,9 @@
       </w:r>
     </w:p>
     <w:p>
+      <w:pPr>
+        <w:ind w:firstLine="0"/>
+      </w:pPr>
       <w:r>
         <w:rPr>
           <w:b/>
@@ -3488,6 +3681,9 @@
       </w:r>
     </w:p>
     <w:p>
+      <w:pPr>
+        <w:ind w:firstLine="0"/>
+      </w:pPr>
       <w:r>
         <w:t>[Add review text and citations here]</w:t>
       </w:r>
@@ -3501,6 +3697,9 @@
       </w:r>
     </w:p>
     <w:p>
+      <w:pPr>
+        <w:ind w:firstLine="0"/>
+      </w:pPr>
       <w:r>
         <w:rPr>
           <w:b/>
@@ -3512,6 +3711,9 @@
       </w:r>
     </w:p>
     <w:p>
+      <w:pPr>
+        <w:ind w:firstLine="0"/>
+      </w:pPr>
       <w:r>
         <w:t>[Add review text and citations here]</w:t>
       </w:r>
@@ -3525,6 +3727,9 @@
       </w:r>
     </w:p>
     <w:p>
+      <w:pPr>
+        <w:ind w:firstLine="0"/>
+      </w:pPr>
       <w:r>
         <w:rPr>
           <w:b/>
@@ -3536,6 +3741,9 @@
       </w:r>
     </w:p>
     <w:p>
+      <w:pPr>
+        <w:ind w:firstLine="0"/>
+      </w:pPr>
       <w:r>
         <w:t>[Add review text and citations here]</w:t>
       </w:r>
@@ -3557,6 +3765,9 @@
       </w:r>
     </w:p>
     <w:p>
+      <w:pPr>
+        <w:ind w:firstLine="0"/>
+      </w:pPr>
       <w:r>
         <w:rPr>
           <w:b/>
@@ -3568,6 +3779,9 @@
       </w:r>
     </w:p>
     <w:p>
+      <w:pPr>
+        <w:ind w:firstLine="0"/>
+      </w:pPr>
       <w:r>
         <w:t>[Add review text and citations here]</w:t>
       </w:r>
@@ -3581,6 +3795,9 @@
       </w:r>
     </w:p>
     <w:p>
+      <w:pPr>
+        <w:ind w:firstLine="0"/>
+      </w:pPr>
       <w:r>
         <w:rPr>
           <w:b/>
@@ -3592,6 +3809,9 @@
       </w:r>
     </w:p>
     <w:p>
+      <w:pPr>
+        <w:ind w:firstLine="0"/>
+      </w:pPr>
       <w:r>
         <w:t>[Add review text and citations here]</w:t>
       </w:r>
@@ -3605,6 +3825,9 @@
       </w:r>
     </w:p>
     <w:p>
+      <w:pPr>
+        <w:ind w:firstLine="0"/>
+      </w:pPr>
       <w:r>
         <w:rPr>
           <w:b/>
@@ -3616,6 +3839,9 @@
       </w:r>
     </w:p>
     <w:p>
+      <w:pPr>
+        <w:ind w:firstLine="0"/>
+      </w:pPr>
       <w:r>
         <w:t>[Add review text and citations here]</w:t>
       </w:r>
@@ -3629,6 +3855,9 @@
       </w:r>
     </w:p>
     <w:p>
+      <w:pPr>
+        <w:ind w:firstLine="0"/>
+      </w:pPr>
       <w:r>
         <w:rPr>
           <w:b/>
@@ -3640,6 +3869,9 @@
       </w:r>
     </w:p>
     <w:p>
+      <w:pPr>
+        <w:ind w:firstLine="0"/>
+      </w:pPr>
       <w:r>
         <w:t>[Add review text and citations here]</w:t>
       </w:r>
@@ -3653,6 +3885,9 @@
       </w:r>
     </w:p>
     <w:p>
+      <w:pPr>
+        <w:ind w:firstLine="0"/>
+      </w:pPr>
       <w:r>
         <w:rPr>
           <w:b/>
@@ -3664,6 +3899,9 @@
       </w:r>
     </w:p>
     <w:p>
+      <w:pPr>
+        <w:ind w:firstLine="0"/>
+      </w:pPr>
       <w:r>
         <w:t>[Add review text and citations here]</w:t>
       </w:r>
@@ -3677,6 +3915,9 @@
       </w:r>
     </w:p>
     <w:p>
+      <w:pPr>
+        <w:ind w:firstLine="0"/>
+      </w:pPr>
       <w:r>
         <w:rPr>
           <w:b/>
@@ -3688,6 +3929,9 @@
       </w:r>
     </w:p>
     <w:p>
+      <w:pPr>
+        <w:ind w:firstLine="0"/>
+      </w:pPr>
       <w:r>
         <w:t>[Add review text and citations here]</w:t>
       </w:r>
@@ -3709,6 +3953,9 @@
       </w:r>
     </w:p>
     <w:p>
+      <w:pPr>
+        <w:ind w:firstLine="0"/>
+      </w:pPr>
       <w:r>
         <w:rPr>
           <w:b/>
@@ -3720,6 +3967,9 @@
       </w:r>
     </w:p>
     <w:p>
+      <w:pPr>
+        <w:ind w:firstLine="0"/>
+      </w:pPr>
       <w:r>
         <w:t>[Add review text and citations here]</w:t>
       </w:r>
@@ -3733,6 +3983,9 @@
       </w:r>
     </w:p>
     <w:p>
+      <w:pPr>
+        <w:ind w:firstLine="0"/>
+      </w:pPr>
       <w:r>
         <w:rPr>
           <w:b/>
@@ -3744,6 +3997,9 @@
       </w:r>
     </w:p>
     <w:p>
+      <w:pPr>
+        <w:ind w:firstLine="0"/>
+      </w:pPr>
       <w:r>
         <w:t>[Add review text and citations here]</w:t>
       </w:r>
@@ -3757,6 +4013,9 @@
       </w:r>
     </w:p>
     <w:p>
+      <w:pPr>
+        <w:ind w:firstLine="0"/>
+      </w:pPr>
       <w:r>
         <w:rPr>
           <w:b/>
@@ -3768,6 +4027,9 @@
       </w:r>
     </w:p>
     <w:p>
+      <w:pPr>
+        <w:ind w:firstLine="0"/>
+      </w:pPr>
       <w:r>
         <w:t>[Add review text and citations here]</w:t>
       </w:r>
@@ -3781,6 +4043,9 @@
       </w:r>
     </w:p>
     <w:p>
+      <w:pPr>
+        <w:ind w:firstLine="0"/>
+      </w:pPr>
       <w:r>
         <w:rPr>
           <w:b/>
@@ -3792,6 +4057,9 @@
       </w:r>
     </w:p>
     <w:p>
+      <w:pPr>
+        <w:ind w:firstLine="0"/>
+      </w:pPr>
       <w:r>
         <w:lastRenderedPageBreak/>
         <w:t>[Add review text and citations here]</w:t>
@@ -3806,6 +4074,9 @@
       </w:r>
     </w:p>
     <w:p>
+      <w:pPr>
+        <w:ind w:firstLine="0"/>
+      </w:pPr>
       <w:r>
         <w:rPr>
           <w:b/>
@@ -3817,6 +4088,9 @@
       </w:r>
     </w:p>
     <w:p>
+      <w:pPr>
+        <w:ind w:firstLine="0"/>
+      </w:pPr>
       <w:r>
         <w:t>[Add review text and citations here]</w:t>
       </w:r>
@@ -3830,6 +4104,9 @@
       </w:r>
     </w:p>
     <w:p>
+      <w:pPr>
+        <w:ind w:firstLine="0"/>
+      </w:pPr>
       <w:r>
         <w:rPr>
           <w:b/>
@@ -3841,6 +4118,9 @@
       </w:r>
     </w:p>
     <w:p>
+      <w:pPr>
+        <w:ind w:firstLine="0"/>
+      </w:pPr>
       <w:r>
         <w:t>[Add review text and citations here]</w:t>
       </w:r>
@@ -3854,6 +4134,9 @@
       </w:r>
     </w:p>
     <w:p>
+      <w:pPr>
+        <w:ind w:firstLine="0"/>
+      </w:pPr>
       <w:r>
         <w:rPr>
           <w:b/>
@@ -3865,6 +4148,9 @@
       </w:r>
     </w:p>
     <w:p>
+      <w:pPr>
+        <w:ind w:firstLine="0"/>
+      </w:pPr>
       <w:r>
         <w:t>[Add review text and citations here]</w:t>
       </w:r>
@@ -3886,6 +4172,9 @@
       </w:r>
     </w:p>
     <w:p>
+      <w:pPr>
+        <w:ind w:firstLine="0"/>
+      </w:pPr>
       <w:r>
         <w:rPr>
           <w:b/>
@@ -3897,6 +4186,9 @@
       </w:r>
     </w:p>
     <w:p>
+      <w:pPr>
+        <w:ind w:firstLine="0"/>
+      </w:pPr>
       <w:r>
         <w:t>[Add review text and citations here]</w:t>
       </w:r>
@@ -3910,6 +4202,9 @@
       </w:r>
     </w:p>
     <w:p>
+      <w:pPr>
+        <w:ind w:firstLine="0"/>
+      </w:pPr>
       <w:r>
         <w:rPr>
           <w:b/>
@@ -3921,6 +4216,9 @@
       </w:r>
     </w:p>
     <w:p>
+      <w:pPr>
+        <w:ind w:firstLine="0"/>
+      </w:pPr>
       <w:r>
         <w:t>[Add review text and citations here]</w:t>
       </w:r>
@@ -3934,6 +4232,9 @@
       </w:r>
     </w:p>
     <w:p>
+      <w:pPr>
+        <w:ind w:firstLine="0"/>
+      </w:pPr>
       <w:r>
         <w:rPr>
           <w:b/>
@@ -3945,6 +4246,9 @@
       </w:r>
     </w:p>
     <w:p>
+      <w:pPr>
+        <w:ind w:firstLine="0"/>
+      </w:pPr>
       <w:r>
         <w:t>[Add review text and citations here]</w:t>
       </w:r>
@@ -3958,6 +4262,9 @@
       </w:r>
     </w:p>
     <w:p>
+      <w:pPr>
+        <w:ind w:firstLine="0"/>
+      </w:pPr>
       <w:r>
         <w:rPr>
           <w:b/>
@@ -3969,6 +4276,9 @@
       </w:r>
     </w:p>
     <w:p>
+      <w:pPr>
+        <w:ind w:firstLine="0"/>
+      </w:pPr>
       <w:r>
         <w:t>[Add review text and citations here]</w:t>
       </w:r>
@@ -3982,6 +4292,9 @@
       </w:r>
     </w:p>
     <w:p>
+      <w:pPr>
+        <w:ind w:firstLine="0"/>
+      </w:pPr>
       <w:r>
         <w:rPr>
           <w:b/>
@@ -3993,6 +4306,9 @@
       </w:r>
     </w:p>
     <w:p>
+      <w:pPr>
+        <w:ind w:firstLine="0"/>
+      </w:pPr>
       <w:r>
         <w:t>[Add review text and citations here]</w:t>
       </w:r>
@@ -4006,6 +4322,9 @@
       </w:r>
     </w:p>
     <w:p>
+      <w:pPr>
+        <w:ind w:firstLine="0"/>
+      </w:pPr>
       <w:r>
         <w:rPr>
           <w:b/>
@@ -4017,6 +4336,9 @@
       </w:r>
     </w:p>
     <w:p>
+      <w:pPr>
+        <w:ind w:firstLine="0"/>
+      </w:pPr>
       <w:r>
         <w:t>[Add review text and citations here]</w:t>
       </w:r>
@@ -4038,6 +4360,9 @@
       </w:r>
     </w:p>
     <w:p>
+      <w:pPr>
+        <w:ind w:firstLine="0"/>
+      </w:pPr>
       <w:r>
         <w:rPr>
           <w:b/>
@@ -4049,6 +4374,9 @@
       </w:r>
     </w:p>
     <w:p>
+      <w:pPr>
+        <w:ind w:firstLine="0"/>
+      </w:pPr>
       <w:r>
         <w:t>[Add review text and citations here]</w:t>
       </w:r>
@@ -4062,6 +4390,9 @@
       </w:r>
     </w:p>
     <w:p>
+      <w:pPr>
+        <w:ind w:firstLine="0"/>
+      </w:pPr>
       <w:r>
         <w:rPr>
           <w:b/>
@@ -4073,6 +4404,9 @@
       </w:r>
     </w:p>
     <w:p>
+      <w:pPr>
+        <w:ind w:firstLine="0"/>
+      </w:pPr>
       <w:r>
         <w:t>[Add review text and citations here]</w:t>
       </w:r>
@@ -4086,6 +4420,9 @@
       </w:r>
     </w:p>
     <w:p>
+      <w:pPr>
+        <w:ind w:firstLine="0"/>
+      </w:pPr>
       <w:r>
         <w:rPr>
           <w:b/>
@@ -4097,6 +4434,9 @@
       </w:r>
     </w:p>
     <w:p>
+      <w:pPr>
+        <w:ind w:firstLine="0"/>
+      </w:pPr>
       <w:r>
         <w:t>[Add review text and citations here]</w:t>
       </w:r>
@@ -4110,6 +4450,9 @@
       </w:r>
     </w:p>
     <w:p>
+      <w:pPr>
+        <w:ind w:firstLine="0"/>
+      </w:pPr>
       <w:r>
         <w:rPr>
           <w:b/>
@@ -4121,6 +4464,9 @@
       </w:r>
     </w:p>
     <w:p>
+      <w:pPr>
+        <w:ind w:firstLine="0"/>
+      </w:pPr>
       <w:r>
         <w:lastRenderedPageBreak/>
         <w:t>[Add review text and citations here]</w:t>
@@ -4135,6 +4481,9 @@
       </w:r>
     </w:p>
     <w:p>
+      <w:pPr>
+        <w:ind w:firstLine="0"/>
+      </w:pPr>
       <w:r>
         <w:rPr>
           <w:b/>
@@ -4146,6 +4495,9 @@
       </w:r>
     </w:p>
     <w:p>
+      <w:pPr>
+        <w:ind w:firstLine="0"/>
+      </w:pPr>
       <w:r>
         <w:t>[Add review text and citations here]</w:t>
       </w:r>
@@ -4167,6 +4519,9 @@
       </w:r>
     </w:p>
     <w:p>
+      <w:pPr>
+        <w:ind w:firstLine="0"/>
+      </w:pPr>
       <w:r>
         <w:rPr>
           <w:b/>
@@ -4178,6 +4533,9 @@
       </w:r>
     </w:p>
     <w:p>
+      <w:pPr>
+        <w:ind w:firstLine="0"/>
+      </w:pPr>
       <w:r>
         <w:t>[Add review text and citations here]</w:t>
       </w:r>
@@ -4191,6 +4549,9 @@
       </w:r>
     </w:p>
     <w:p>
+      <w:pPr>
+        <w:ind w:firstLine="0"/>
+      </w:pPr>
       <w:r>
         <w:rPr>
           <w:b/>
@@ -4202,6 +4563,9 @@
       </w:r>
     </w:p>
     <w:p>
+      <w:pPr>
+        <w:ind w:firstLine="0"/>
+      </w:pPr>
       <w:r>
         <w:t>[Add review text and citations here]</w:t>
       </w:r>
@@ -4215,6 +4579,9 @@
       </w:r>
     </w:p>
     <w:p>
+      <w:pPr>
+        <w:ind w:firstLine="0"/>
+      </w:pPr>
       <w:r>
         <w:rPr>
           <w:b/>
@@ -4226,6 +4593,9 @@
       </w:r>
     </w:p>
     <w:p>
+      <w:pPr>
+        <w:ind w:firstLine="0"/>
+      </w:pPr>
       <w:r>
         <w:t>[Add review text and citations here]</w:t>
       </w:r>
@@ -4239,6 +4609,9 @@
       </w:r>
     </w:p>
     <w:p>
+      <w:pPr>
+        <w:ind w:firstLine="0"/>
+      </w:pPr>
       <w:r>
         <w:rPr>
           <w:b/>
@@ -4250,6 +4623,9 @@
       </w:r>
     </w:p>
     <w:p>
+      <w:pPr>
+        <w:ind w:firstLine="0"/>
+      </w:pPr>
       <w:r>
         <w:t>[Add review text and citations here]</w:t>
       </w:r>
@@ -4263,6 +4639,9 @@
       </w:r>
     </w:p>
     <w:p>
+      <w:pPr>
+        <w:ind w:firstLine="0"/>
+      </w:pPr>
       <w:r>
         <w:rPr>
           <w:b/>
@@ -4274,6 +4653,9 @@
       </w:r>
     </w:p>
     <w:p>
+      <w:pPr>
+        <w:ind w:firstLine="0"/>
+      </w:pPr>
       <w:r>
         <w:t>[Add review text and citations here]</w:t>
       </w:r>
@@ -4287,6 +4669,9 @@
       </w:r>
     </w:p>
     <w:p>
+      <w:pPr>
+        <w:ind w:firstLine="0"/>
+      </w:pPr>
       <w:r>
         <w:rPr>
           <w:b/>
@@ -4298,6 +4683,9 @@
       </w:r>
     </w:p>
     <w:p>
+      <w:pPr>
+        <w:ind w:firstLine="0"/>
+      </w:pPr>
       <w:r>
         <w:t>[Add review text and citations here]</w:t>
       </w:r>
@@ -4319,6 +4707,9 @@
       </w:r>
     </w:p>
     <w:p>
+      <w:pPr>
+        <w:ind w:firstLine="0"/>
+      </w:pPr>
       <w:r>
         <w:rPr>
           <w:b/>
@@ -4330,6 +4721,9 @@
       </w:r>
     </w:p>
     <w:p>
+      <w:pPr>
+        <w:ind w:firstLine="0"/>
+      </w:pPr>
       <w:r>
         <w:t>[Add review text and citations here]</w:t>
       </w:r>
@@ -4343,6 +4737,9 @@
       </w:r>
     </w:p>
     <w:p>
+      <w:pPr>
+        <w:ind w:firstLine="0"/>
+      </w:pPr>
       <w:r>
         <w:rPr>
           <w:b/>
@@ -4354,6 +4751,9 @@
       </w:r>
     </w:p>
     <w:p>
+      <w:pPr>
+        <w:ind w:firstLine="0"/>
+      </w:pPr>
       <w:r>
         <w:t>[Add review text and citations here]</w:t>
       </w:r>
@@ -4367,6 +4767,9 @@
       </w:r>
     </w:p>
     <w:p>
+      <w:pPr>
+        <w:ind w:firstLine="0"/>
+      </w:pPr>
       <w:r>
         <w:rPr>
           <w:b/>
@@ -4378,6 +4781,9 @@
       </w:r>
     </w:p>
     <w:p>
+      <w:pPr>
+        <w:ind w:firstLine="0"/>
+      </w:pPr>
       <w:r>
         <w:t>[Add review text and citations here]</w:t>
       </w:r>
@@ -4391,6 +4797,9 @@
       </w:r>
     </w:p>
     <w:p>
+      <w:pPr>
+        <w:ind w:firstLine="0"/>
+      </w:pPr>
       <w:r>
         <w:t>[Add and update content here]</w:t>
       </w:r>
@@ -4404,6 +4813,9 @@
       </w:r>
     </w:p>
     <w:p>
+      <w:pPr>
+        <w:ind w:firstLine="0"/>
+      </w:pPr>
       <w:r>
         <w:t>[Add and update content here]</w:t>
       </w:r>
@@ -5540,6 +5952,9 @@
       </w:r>
     </w:p>
     <w:p>
+      <w:pPr>
+        <w:ind w:firstLine="0"/>
+      </w:pPr>
       <w:r>
         <w:fldChar w:fldCharType="end"/>
       </w:r>
@@ -6317,7 +6732,7 @@
     <w:rsid w:val="005C6ACE"/>
     <w:pPr>
       <w:spacing w:after="0" w:line="360" w:lineRule="auto"/>
-      <w:ind w:firstLine="432"/>
+      <w:ind w:firstLine="0"/>
       <w:jc w:val="both"/>
     </w:pPr>
     <w:rPr>
@@ -17377,7 +17792,7 @@
       <w:keepNext/>
       <w:keepLines/>
       <w:spacing w:before="240" w:after="120"/>
-      <w:ind w:firstLine="360"/>
+      <w:ind w:firstLine="0"/>
       <w:jc w:val="center"/>
     </w:pPr>
     <w:rPr>

</xml_diff>